<commit_message>
1.bin file instructions implemented, but debugging is needed!
</commit_message>
<xml_diff>
--- a/RISC.docx
+++ b/RISC.docx
@@ -609,21 +609,7 @@
         <w:rPr>
           <w:lang w:val="en-US"/>
         </w:rPr>
-        <w:t>Code of the exact operation (</w:t>
-      </w:r>
-      <w:proofErr w:type="spellStart"/>
-      <w:r>
-        <w:rPr>
-          <w:lang w:val="en-US"/>
-        </w:rPr>
-        <w:t>eg</w:t>
-      </w:r>
-      <w:proofErr w:type="spellEnd"/>
-      <w:r>
-        <w:rPr>
-          <w:lang w:val="en-US"/>
-        </w:rPr>
-        <w:t>: plus)</w:t>
+        <w:t>Code of the exact operation (eg: plus)</w:t>
       </w:r>
     </w:p>
     <w:p>
@@ -637,19 +623,11 @@
           <w:lang w:val="en-US"/>
         </w:rPr>
       </w:pPr>
-      <w:proofErr w:type="spellStart"/>
-      <w:r>
-        <w:rPr>
-          <w:lang w:val="en-US"/>
-        </w:rPr>
-        <w:t>rd</w:t>
-      </w:r>
-      <w:proofErr w:type="spellEnd"/>
-      <w:r>
-        <w:rPr>
-          <w:lang w:val="en-US"/>
-        </w:rPr>
-        <w:t>: Destination register</w:t>
+      <w:r>
+        <w:rPr>
+          <w:lang w:val="en-US"/>
+        </w:rPr>
+        <w:t>rd: Destination register</w:t>
       </w:r>
     </w:p>
     <w:p>
@@ -729,19 +707,11 @@
           <w:lang w:val="en-US"/>
         </w:rPr>
       </w:pPr>
-      <w:proofErr w:type="spellStart"/>
-      <w:r>
-        <w:rPr>
-          <w:lang w:val="en-US"/>
-        </w:rPr>
-        <w:t>imm</w:t>
-      </w:r>
-      <w:proofErr w:type="spellEnd"/>
-      <w:r>
-        <w:rPr>
-          <w:lang w:val="en-US"/>
-        </w:rPr>
-        <w:t xml:space="preserve">: immediate value (basically </w:t>
+      <w:r>
+        <w:rPr>
+          <w:lang w:val="en-US"/>
+        </w:rPr>
+        <w:t xml:space="preserve">imm: immediate value (basically </w:t>
       </w:r>
       <w:r>
         <w:rPr>
@@ -816,7 +786,7 @@
         <w:rPr>
           <w:lang w:val="en-US"/>
         </w:rPr>
-        <w:t>U</w:t>
+        <w:t>I</w:t>
       </w:r>
       <w:r>
         <w:rPr>
@@ -840,6 +810,30 @@
         <w:rPr>
           <w:lang w:val="en-US"/>
         </w:rPr>
+        <w:t xml:space="preserve">It is actually calling addi (what is an I-Type) on </w:t>
+      </w:r>
+      <w:r>
+        <w:rPr>
+          <w:lang w:val="en-US"/>
+        </w:rPr>
+        <w:t>machine code level</w:t>
+      </w:r>
+    </w:p>
+    <w:p>
+      <w:pPr>
+        <w:pStyle w:val="ListParagraph"/>
+        <w:numPr>
+          <w:ilvl w:val="1"/>
+          <w:numId w:val="5"/>
+        </w:numPr>
+        <w:rPr>
+          <w:lang w:val="en-US"/>
+        </w:rPr>
+      </w:pPr>
+      <w:r>
+        <w:rPr>
+          <w:lang w:val="en-US"/>
+        </w:rPr>
         <w:t>loading an integer into a register</w:t>
       </w:r>
     </w:p>
@@ -854,14 +848,12 @@
           <w:lang w:val="en-US"/>
         </w:rPr>
       </w:pPr>
-      <w:proofErr w:type="spellStart"/>
       <w:r>
         <w:rPr>
           <w:lang w:val="en-US"/>
         </w:rPr>
         <w:t>mulw</w:t>
       </w:r>
-      <w:proofErr w:type="spellEnd"/>
       <w:r>
         <w:rPr>
           <w:lang w:val="en-US"/>
@@ -878,21 +870,7 @@
         <w:rPr>
           <w:lang w:val="en-US"/>
         </w:rPr>
-        <w:t xml:space="preserve"> </w:t>
-      </w:r>
-      <w:proofErr w:type="spellStart"/>
-      <w:r>
-        <w:rPr>
-          <w:lang w:val="en-US"/>
-        </w:rPr>
-        <w:t>MULtiply</w:t>
-      </w:r>
-      <w:proofErr w:type="spellEnd"/>
-      <w:r>
-        <w:rPr>
-          <w:lang w:val="en-US"/>
-        </w:rPr>
-        <w:t xml:space="preserve"> Word (</w:t>
+        <w:t xml:space="preserve"> MULtiply Word (</w:t>
       </w:r>
       <w:r>
         <w:rPr>
@@ -942,19 +920,11 @@
         </w:rPr>
         <w:t xml:space="preserve">takes the lower 32 bits </w:t>
       </w:r>
-      <w:proofErr w:type="spellStart"/>
-      <w:r>
-        <w:rPr>
-          <w:lang w:val="en-US"/>
-        </w:rPr>
-        <w:t>as signed</w:t>
-      </w:r>
-      <w:proofErr w:type="spellEnd"/>
-      <w:r>
-        <w:rPr>
-          <w:lang w:val="en-US"/>
-        </w:rPr>
-        <w:t xml:space="preserve"> </w:t>
+      <w:r>
+        <w:rPr>
+          <w:lang w:val="en-US"/>
+        </w:rPr>
+        <w:t xml:space="preserve">as signed </w:t>
       </w:r>
       <w:r>
         <w:rPr>
@@ -966,21 +936,7 @@
         <w:rPr>
           <w:lang w:val="en-US"/>
         </w:rPr>
-        <w:t xml:space="preserve">1 and r2 and multiplies them into the </w:t>
-      </w:r>
-      <w:proofErr w:type="spellStart"/>
-      <w:r>
-        <w:rPr>
-          <w:lang w:val="en-US"/>
-        </w:rPr>
-        <w:t>rd</w:t>
-      </w:r>
-      <w:proofErr w:type="spellEnd"/>
-      <w:r>
-        <w:rPr>
-          <w:lang w:val="en-US"/>
-        </w:rPr>
-        <w:t xml:space="preserve"> 64 bit register</w:t>
+        <w:t>1 and r2 and multiplies them into the rd 64 bit register</w:t>
       </w:r>
     </w:p>
     <w:p>
@@ -994,14 +950,12 @@
           <w:lang w:val="en-US"/>
         </w:rPr>
       </w:pPr>
-      <w:proofErr w:type="spellStart"/>
       <w:r>
         <w:rPr>
           <w:lang w:val="en-US"/>
         </w:rPr>
         <w:t>beqz</w:t>
       </w:r>
-      <w:proofErr w:type="spellEnd"/>
       <w:r>
         <w:rPr>
           <w:lang w:val="en-US"/>
@@ -1036,21 +990,7 @@
         <w:rPr>
           <w:lang w:val="en-US"/>
         </w:rPr>
-        <w:t xml:space="preserve">because it’s a more specific version of </w:t>
-      </w:r>
-      <w:proofErr w:type="spellStart"/>
-      <w:r>
-        <w:rPr>
-          <w:lang w:val="en-US"/>
-        </w:rPr>
-        <w:t>beq</w:t>
-      </w:r>
-      <w:proofErr w:type="spellEnd"/>
-      <w:r>
-        <w:rPr>
-          <w:lang w:val="en-US"/>
-        </w:rPr>
-        <w:t xml:space="preserve"> it is B-Type</w:t>
+        <w:t>because it’s a more specific version of beq it is B-Type</w:t>
       </w:r>
       <w:r>
         <w:rPr>
@@ -1142,14 +1082,12 @@
           <w:lang w:val="en-US"/>
         </w:rPr>
       </w:pPr>
-      <w:proofErr w:type="spellStart"/>
       <w:r>
         <w:rPr>
           <w:lang w:val="en-US"/>
         </w:rPr>
         <w:t>addi</w:t>
       </w:r>
-      <w:proofErr w:type="spellEnd"/>
       <w:r>
         <w:rPr>
           <w:lang w:val="en-US"/>
@@ -1228,14 +1166,12 @@
           <w:lang w:val="en-US"/>
         </w:rPr>
       </w:pPr>
-      <w:proofErr w:type="spellStart"/>
       <w:r>
         <w:rPr>
           <w:lang w:val="en-US"/>
         </w:rPr>
         <w:t>jal</w:t>
       </w:r>
-      <w:proofErr w:type="spellEnd"/>
       <w:r>
         <w:rPr>
           <w:lang w:val="en-US"/>
@@ -1288,21 +1224,7 @@
         <w:rPr>
           <w:lang w:val="en-US"/>
         </w:rPr>
-        <w:t xml:space="preserve">it saves to the current program counter in </w:t>
-      </w:r>
-      <w:proofErr w:type="spellStart"/>
-      <w:r>
-        <w:rPr>
-          <w:lang w:val="en-US"/>
-        </w:rPr>
-        <w:t>rd</w:t>
-      </w:r>
-      <w:proofErr w:type="spellEnd"/>
-      <w:r>
-        <w:rPr>
-          <w:lang w:val="en-US"/>
-        </w:rPr>
-        <w:t xml:space="preserve">, then </w:t>
+        <w:t xml:space="preserve">it saves to the current program counter in rd, then </w:t>
       </w:r>
       <w:r>
         <w:rPr>
@@ -1326,30 +1248,8 @@
         <w:rPr>
           <w:lang w:val="en-US"/>
         </w:rPr>
-        <w:t xml:space="preserve">if we want to go back to where </w:t>
-      </w:r>
-      <w:proofErr w:type="spellStart"/>
-      <w:r>
-        <w:rPr>
-          <w:lang w:val="en-US"/>
-        </w:rPr>
-        <w:t>jal</w:t>
-      </w:r>
-      <w:proofErr w:type="spellEnd"/>
-      <w:r>
-        <w:rPr>
-          <w:lang w:val="en-US"/>
-        </w:rPr>
-        <w:t xml:space="preserve"> is called we just jump to the value stored in </w:t>
-      </w:r>
-      <w:proofErr w:type="spellStart"/>
-      <w:r>
-        <w:rPr>
-          <w:lang w:val="en-US"/>
-        </w:rPr>
-        <w:t>rd</w:t>
-      </w:r>
-      <w:proofErr w:type="spellEnd"/>
+        <w:t>if we want to go back to where jal is called we just jump to the value stored in rd</w:t>
+      </w:r>
     </w:p>
     <w:p>
       <w:pPr>
@@ -1362,7 +1262,6 @@
           <w:lang w:val="en-US"/>
         </w:rPr>
       </w:pPr>
-      <w:proofErr w:type="spellStart"/>
       <w:r>
         <w:rPr>
           <w:lang w:val="en-US"/>
@@ -1375,7 +1274,6 @@
         </w:rPr>
         <w:t>w</w:t>
       </w:r>
-      <w:proofErr w:type="spellEnd"/>
       <w:r>
         <w:rPr>
           <w:lang w:val="en-US"/>
@@ -1392,21 +1290,7 @@
         <w:rPr>
           <w:lang w:val="en-US"/>
         </w:rPr>
-        <w:t xml:space="preserve"> Loads 32 bit value into </w:t>
-      </w:r>
-      <w:proofErr w:type="spellStart"/>
-      <w:r>
-        <w:rPr>
-          <w:lang w:val="en-US"/>
-        </w:rPr>
-        <w:t>rd</w:t>
-      </w:r>
-      <w:proofErr w:type="spellEnd"/>
-      <w:r>
-        <w:rPr>
-          <w:lang w:val="en-US"/>
-        </w:rPr>
-        <w:t xml:space="preserve"> (</w:t>
+        <w:t xml:space="preserve"> Loads 32 bit value into rd (</w:t>
       </w:r>
       <w:r>
         <w:rPr>
@@ -1426,14 +1310,12 @@
           <w:lang w:val="en-US"/>
         </w:rPr>
       </w:pPr>
-      <w:proofErr w:type="spellStart"/>
       <w:r>
         <w:rPr>
           <w:lang w:val="en-US"/>
         </w:rPr>
         <w:t>sw</w:t>
       </w:r>
-      <w:proofErr w:type="spellEnd"/>
       <w:r>
         <w:rPr>
           <w:lang w:val="en-US"/>
@@ -1456,21 +1338,7 @@
         <w:rPr>
           <w:lang w:val="en-US"/>
         </w:rPr>
-        <w:t xml:space="preserve">rs2 into </w:t>
-      </w:r>
-      <w:proofErr w:type="spellStart"/>
-      <w:r>
-        <w:rPr>
-          <w:lang w:val="en-US"/>
-        </w:rPr>
-        <w:t>rd</w:t>
-      </w:r>
-      <w:proofErr w:type="spellEnd"/>
-      <w:r>
-        <w:rPr>
-          <w:lang w:val="en-US"/>
-        </w:rPr>
-        <w:t xml:space="preserve"> (S-Type)</w:t>
+        <w:t>rs2 into rd (S-Type)</w:t>
       </w:r>
     </w:p>
     <w:p>
@@ -1536,30 +1404,8 @@
         <w:rPr>
           <w:lang w:val="en-US"/>
         </w:rPr>
-        <w:t xml:space="preserve">Returns to the </w:t>
-      </w:r>
-      <w:proofErr w:type="spellStart"/>
-      <w:r>
-        <w:rPr>
-          <w:lang w:val="en-US"/>
-        </w:rPr>
-        <w:t>ra</w:t>
-      </w:r>
-      <w:proofErr w:type="spellEnd"/>
-      <w:r>
-        <w:rPr>
-          <w:lang w:val="en-US"/>
-        </w:rPr>
-        <w:t xml:space="preserve"> value which was saved by the </w:t>
-      </w:r>
-      <w:proofErr w:type="spellStart"/>
-      <w:r>
-        <w:rPr>
-          <w:lang w:val="en-US"/>
-        </w:rPr>
-        <w:t>jal</w:t>
-      </w:r>
-      <w:proofErr w:type="spellEnd"/>
+        <w:t>Returns to the ra value which was saved by the jal</w:t>
+      </w:r>
     </w:p>
     <w:sectPr>
       <w:pgSz w:w="11906" w:h="16838"/>

</xml_diff>

<commit_message>
Stack introduced. Every instruction that the three sample program works with are implemented and working.
</commit_message>
<xml_diff>
--- a/RISC.docx
+++ b/RISC.docx
@@ -609,7 +609,21 @@
         <w:rPr>
           <w:lang w:val="en-US"/>
         </w:rPr>
-        <w:t>Code of the exact operation (eg: plus)</w:t>
+        <w:t>Code of the exact operation (</w:t>
+      </w:r>
+      <w:proofErr w:type="spellStart"/>
+      <w:r>
+        <w:rPr>
+          <w:lang w:val="en-US"/>
+        </w:rPr>
+        <w:t>eg</w:t>
+      </w:r>
+      <w:proofErr w:type="spellEnd"/>
+      <w:r>
+        <w:rPr>
+          <w:lang w:val="en-US"/>
+        </w:rPr>
+        <w:t>: plus)</w:t>
       </w:r>
     </w:p>
     <w:p>
@@ -623,11 +637,19 @@
           <w:lang w:val="en-US"/>
         </w:rPr>
       </w:pPr>
-      <w:r>
-        <w:rPr>
-          <w:lang w:val="en-US"/>
-        </w:rPr>
-        <w:t>rd: Destination register</w:t>
+      <w:proofErr w:type="spellStart"/>
+      <w:r>
+        <w:rPr>
+          <w:lang w:val="en-US"/>
+        </w:rPr>
+        <w:t>rd</w:t>
+      </w:r>
+      <w:proofErr w:type="spellEnd"/>
+      <w:r>
+        <w:rPr>
+          <w:lang w:val="en-US"/>
+        </w:rPr>
+        <w:t>: Destination register</w:t>
       </w:r>
     </w:p>
     <w:p>
@@ -707,11 +729,19 @@
           <w:lang w:val="en-US"/>
         </w:rPr>
       </w:pPr>
-      <w:r>
-        <w:rPr>
-          <w:lang w:val="en-US"/>
-        </w:rPr>
-        <w:t xml:space="preserve">imm: immediate value (basically </w:t>
+      <w:proofErr w:type="spellStart"/>
+      <w:r>
+        <w:rPr>
+          <w:lang w:val="en-US"/>
+        </w:rPr>
+        <w:t>imm</w:t>
+      </w:r>
+      <w:proofErr w:type="spellEnd"/>
+      <w:r>
+        <w:rPr>
+          <w:lang w:val="en-US"/>
+        </w:rPr>
+        <w:t xml:space="preserve">: immediate value (basically </w:t>
       </w:r>
       <w:r>
         <w:rPr>
@@ -810,7 +840,21 @@
         <w:rPr>
           <w:lang w:val="en-US"/>
         </w:rPr>
-        <w:t xml:space="preserve">It is actually calling addi (what is an I-Type) on </w:t>
+        <w:t xml:space="preserve">It is actually calling </w:t>
+      </w:r>
+      <w:proofErr w:type="spellStart"/>
+      <w:r>
+        <w:rPr>
+          <w:lang w:val="en-US"/>
+        </w:rPr>
+        <w:t>addi</w:t>
+      </w:r>
+      <w:proofErr w:type="spellEnd"/>
+      <w:r>
+        <w:rPr>
+          <w:lang w:val="en-US"/>
+        </w:rPr>
+        <w:t xml:space="preserve"> (what is an I-Type) on </w:t>
       </w:r>
       <w:r>
         <w:rPr>
@@ -848,12 +892,14 @@
           <w:lang w:val="en-US"/>
         </w:rPr>
       </w:pPr>
+      <w:proofErr w:type="spellStart"/>
       <w:r>
         <w:rPr>
           <w:lang w:val="en-US"/>
         </w:rPr>
         <w:t>mulw</w:t>
       </w:r>
+      <w:proofErr w:type="spellEnd"/>
       <w:r>
         <w:rPr>
           <w:lang w:val="en-US"/>
@@ -870,7 +916,21 @@
         <w:rPr>
           <w:lang w:val="en-US"/>
         </w:rPr>
-        <w:t xml:space="preserve"> MULtiply Word (</w:t>
+        <w:t xml:space="preserve"> </w:t>
+      </w:r>
+      <w:proofErr w:type="spellStart"/>
+      <w:r>
+        <w:rPr>
+          <w:lang w:val="en-US"/>
+        </w:rPr>
+        <w:t>MULtiply</w:t>
+      </w:r>
+      <w:proofErr w:type="spellEnd"/>
+      <w:r>
+        <w:rPr>
+          <w:lang w:val="en-US"/>
+        </w:rPr>
+        <w:t xml:space="preserve"> Word (</w:t>
       </w:r>
       <w:r>
         <w:rPr>
@@ -920,11 +980,19 @@
         </w:rPr>
         <w:t xml:space="preserve">takes the lower 32 bits </w:t>
       </w:r>
-      <w:r>
-        <w:rPr>
-          <w:lang w:val="en-US"/>
-        </w:rPr>
-        <w:t xml:space="preserve">as signed </w:t>
+      <w:proofErr w:type="spellStart"/>
+      <w:r>
+        <w:rPr>
+          <w:lang w:val="en-US"/>
+        </w:rPr>
+        <w:t>as signed</w:t>
+      </w:r>
+      <w:proofErr w:type="spellEnd"/>
+      <w:r>
+        <w:rPr>
+          <w:lang w:val="en-US"/>
+        </w:rPr>
+        <w:t xml:space="preserve"> </w:t>
       </w:r>
       <w:r>
         <w:rPr>
@@ -936,7 +1004,21 @@
         <w:rPr>
           <w:lang w:val="en-US"/>
         </w:rPr>
-        <w:t>1 and r2 and multiplies them into the rd 64 bit register</w:t>
+        <w:t xml:space="preserve">1 and r2 and multiplies them into the </w:t>
+      </w:r>
+      <w:proofErr w:type="spellStart"/>
+      <w:r>
+        <w:rPr>
+          <w:lang w:val="en-US"/>
+        </w:rPr>
+        <w:t>rd</w:t>
+      </w:r>
+      <w:proofErr w:type="spellEnd"/>
+      <w:r>
+        <w:rPr>
+          <w:lang w:val="en-US"/>
+        </w:rPr>
+        <w:t xml:space="preserve"> 64 bit register</w:t>
       </w:r>
     </w:p>
     <w:p>
@@ -950,12 +1032,14 @@
           <w:lang w:val="en-US"/>
         </w:rPr>
       </w:pPr>
+      <w:proofErr w:type="spellStart"/>
       <w:r>
         <w:rPr>
           <w:lang w:val="en-US"/>
         </w:rPr>
         <w:t>beqz</w:t>
       </w:r>
+      <w:proofErr w:type="spellEnd"/>
       <w:r>
         <w:rPr>
           <w:lang w:val="en-US"/>
@@ -990,7 +1074,21 @@
         <w:rPr>
           <w:lang w:val="en-US"/>
         </w:rPr>
-        <w:t>because it’s a more specific version of beq it is B-Type</w:t>
+        <w:t xml:space="preserve">because it’s a more specific version of </w:t>
+      </w:r>
+      <w:proofErr w:type="spellStart"/>
+      <w:r>
+        <w:rPr>
+          <w:lang w:val="en-US"/>
+        </w:rPr>
+        <w:t>beq</w:t>
+      </w:r>
+      <w:proofErr w:type="spellEnd"/>
+      <w:r>
+        <w:rPr>
+          <w:lang w:val="en-US"/>
+        </w:rPr>
+        <w:t xml:space="preserve"> it is B-Type</w:t>
       </w:r>
       <w:r>
         <w:rPr>
@@ -1082,12 +1180,14 @@
           <w:lang w:val="en-US"/>
         </w:rPr>
       </w:pPr>
+      <w:proofErr w:type="spellStart"/>
       <w:r>
         <w:rPr>
           <w:lang w:val="en-US"/>
         </w:rPr>
         <w:t>addi</w:t>
       </w:r>
+      <w:proofErr w:type="spellEnd"/>
       <w:r>
         <w:rPr>
           <w:lang w:val="en-US"/>
@@ -1166,12 +1266,14 @@
           <w:lang w:val="en-US"/>
         </w:rPr>
       </w:pPr>
+      <w:proofErr w:type="spellStart"/>
       <w:r>
         <w:rPr>
           <w:lang w:val="en-US"/>
         </w:rPr>
         <w:t>jal</w:t>
       </w:r>
+      <w:proofErr w:type="spellEnd"/>
       <w:r>
         <w:rPr>
           <w:lang w:val="en-US"/>
@@ -1224,7 +1326,21 @@
         <w:rPr>
           <w:lang w:val="en-US"/>
         </w:rPr>
-        <w:t xml:space="preserve">it saves to the current program counter in rd, then </w:t>
+        <w:t xml:space="preserve">it saves to the current program counter in </w:t>
+      </w:r>
+      <w:proofErr w:type="spellStart"/>
+      <w:r>
+        <w:rPr>
+          <w:lang w:val="en-US"/>
+        </w:rPr>
+        <w:t>rd</w:t>
+      </w:r>
+      <w:proofErr w:type="spellEnd"/>
+      <w:r>
+        <w:rPr>
+          <w:lang w:val="en-US"/>
+        </w:rPr>
+        <w:t xml:space="preserve">, then </w:t>
       </w:r>
       <w:r>
         <w:rPr>
@@ -1248,8 +1364,30 @@
         <w:rPr>
           <w:lang w:val="en-US"/>
         </w:rPr>
-        <w:t>if we want to go back to where jal is called we just jump to the value stored in rd</w:t>
-      </w:r>
+        <w:t xml:space="preserve">if we want to go back to where </w:t>
+      </w:r>
+      <w:proofErr w:type="spellStart"/>
+      <w:r>
+        <w:rPr>
+          <w:lang w:val="en-US"/>
+        </w:rPr>
+        <w:t>jal</w:t>
+      </w:r>
+      <w:proofErr w:type="spellEnd"/>
+      <w:r>
+        <w:rPr>
+          <w:lang w:val="en-US"/>
+        </w:rPr>
+        <w:t xml:space="preserve"> is called we just jump to the value stored in </w:t>
+      </w:r>
+      <w:proofErr w:type="spellStart"/>
+      <w:r>
+        <w:rPr>
+          <w:lang w:val="en-US"/>
+        </w:rPr>
+        <w:t>rd</w:t>
+      </w:r>
+      <w:proofErr w:type="spellEnd"/>
     </w:p>
     <w:p>
       <w:pPr>
@@ -1262,6 +1400,7 @@
           <w:lang w:val="en-US"/>
         </w:rPr>
       </w:pPr>
+      <w:proofErr w:type="spellStart"/>
       <w:r>
         <w:rPr>
           <w:lang w:val="en-US"/>
@@ -1274,6 +1413,7 @@
         </w:rPr>
         <w:t>w</w:t>
       </w:r>
+      <w:proofErr w:type="spellEnd"/>
       <w:r>
         <w:rPr>
           <w:lang w:val="en-US"/>
@@ -1290,7 +1430,21 @@
         <w:rPr>
           <w:lang w:val="en-US"/>
         </w:rPr>
-        <w:t xml:space="preserve"> Loads 32 bit value into rd (</w:t>
+        <w:t xml:space="preserve"> Loads 32 bit value into </w:t>
+      </w:r>
+      <w:proofErr w:type="spellStart"/>
+      <w:r>
+        <w:rPr>
+          <w:lang w:val="en-US"/>
+        </w:rPr>
+        <w:t>rd</w:t>
+      </w:r>
+      <w:proofErr w:type="spellEnd"/>
+      <w:r>
+        <w:rPr>
+          <w:lang w:val="en-US"/>
+        </w:rPr>
+        <w:t xml:space="preserve"> (</w:t>
       </w:r>
       <w:r>
         <w:rPr>
@@ -1310,12 +1464,14 @@
           <w:lang w:val="en-US"/>
         </w:rPr>
       </w:pPr>
+      <w:proofErr w:type="spellStart"/>
       <w:r>
         <w:rPr>
           <w:lang w:val="en-US"/>
         </w:rPr>
         <w:t>sw</w:t>
       </w:r>
+      <w:proofErr w:type="spellEnd"/>
       <w:r>
         <w:rPr>
           <w:lang w:val="en-US"/>
@@ -1338,7 +1494,19 @@
         <w:rPr>
           <w:lang w:val="en-US"/>
         </w:rPr>
-        <w:t>rs2 into rd (S-Type)</w:t>
+        <w:t>rs2 into r</w:t>
+      </w:r>
+      <w:r>
+        <w:rPr>
+          <w:lang w:val="en-US"/>
+        </w:rPr>
+        <w:t>1</w:t>
+      </w:r>
+      <w:r>
+        <w:rPr>
+          <w:lang w:val="en-US"/>
+        </w:rPr>
+        <w:t xml:space="preserve"> (S-Type)</w:t>
       </w:r>
     </w:p>
     <w:p>
@@ -1404,8 +1572,30 @@
         <w:rPr>
           <w:lang w:val="en-US"/>
         </w:rPr>
-        <w:t>Returns to the ra value which was saved by the jal</w:t>
-      </w:r>
+        <w:t xml:space="preserve">Returns to the </w:t>
+      </w:r>
+      <w:proofErr w:type="spellStart"/>
+      <w:r>
+        <w:rPr>
+          <w:lang w:val="en-US"/>
+        </w:rPr>
+        <w:t>ra</w:t>
+      </w:r>
+      <w:proofErr w:type="spellEnd"/>
+      <w:r>
+        <w:rPr>
+          <w:lang w:val="en-US"/>
+        </w:rPr>
+        <w:t xml:space="preserve"> value which was saved by the </w:t>
+      </w:r>
+      <w:proofErr w:type="spellStart"/>
+      <w:r>
+        <w:rPr>
+          <w:lang w:val="en-US"/>
+        </w:rPr>
+        <w:t>jal</w:t>
+      </w:r>
+      <w:proofErr w:type="spellEnd"/>
     </w:p>
     <w:sectPr>
       <w:pgSz w:w="11906" w:h="16838"/>

</xml_diff>